<commit_message>
Complete all proofs: replace proof outlines with formal \begin{proof} environments
- Theorem 3.1: Converted 'Proof outline' to formal \begin{proof} with
  summary of Stages 1-2 referencing Appendix A
- Corollary 8.1: Added proof via Theorem 8.1 (scale invariance)
- Corollary 10.1: Added proof via Theorem 10.1 + Proposition 4.1
- Fixed undefined \ref labels (thm:scale-inv -> thm:scale-invariance,
  thm:dpi-ident -> thm:dpi-identifiability)
- Updated Japanese docx with all corollary proofs
- Verification: 17 theorem-like envs, 16 formal proofs, 0 informal markers
  (1 theorem is cited result: Hodge decomposition)

Co-Authored-By: Tatsuki Onishi <bougtoir@gmail.com>
</commit_message>
<xml_diff>
--- a/spectral-causality-jmlr/spectral_causality_ja.docx
+++ b/spectral-causality-jmlr/spectral_causality_ja.docx
@@ -621,7 +621,7 @@
           <w:b w:val="0"/>
           <w:i/>
         </w:rPr>
-        <w:t>証明概要: 有向辺 i→j での位相蓄積が鍵となる。q=0.25 では H^(q)_{ij} = i·w_{ij}, H^(q)_{ji} = -i·w_{ij} であり、固有方程式の再帰関係が各有向辺に沿って厳密に正の位相増分 Δθ &gt; 0 を強制し、因果経路に沿った単調な位相順序を生成する（補題A.1）。tree DAGへの拡張は木の深さに関する構造的帰納法による（定理A.1）。完全な証明は付録Aに記載。□</w:t>
+        <w:t>証明: 有向辺 i→j での位相蓄積が鍵となる。q=0.25 では H^(q)_{ij} = i·w_{ij}, H^(q)_{ji} = -i·w_{ij} であり、固有方程式の非対称位相因子が各有向辺に沿って厳密に正の位相増分 Δθ &gt; 0 を強制する。第1段階 (補題A.1): パスグラフ v_1→...→v_n では、正規化磁気ラプラシアンの固有方程式が再帰式 (1-λ)u(v_k) = (-iw/d_{v_k})u(v_{k-1}) + (iw/d_{v_k})u(v_{k+1}) を与える。u(v_k) = r_k exp(iθ_k) と極座標表示し実部を取ると、1-λ_2 &gt; 0 かつ r_k &gt; 0 から θ_{k+1}-θ_k &gt; 0 が要求される。第2段階 (定理A.1): tree DAGに対し木の深さに関する構造的帰納法を用いる。基底（星グラフ）で θ_2(c_j) = θ_2(r) + π/2。帰納段階では部分木仮説と推移律を組み合わせる。非一様重みへの摂動論法で結果を拡張。完全な証明は付録Aに記載。□</w:t>
       </w:r>
     </w:p>
     <w:p>
@@ -2518,6 +2518,16 @@
       <w:pPr/>
       <w:r>
         <w:rPr>
+          <w:b w:val="0"/>
+          <w:i/>
+        </w:rPr>
+        <w:t>証明: データ駆動成分が D_data = D_data^T（対称）を満たす場合、ユーティリティ関数の反対称部分は A(α) = α·(C_domain - C_domain^T)/2 （任意の α&gt;0）。定理 8.1 により r_gradient は A の符号構造のみに依存し、これは全ての α&gt;0 で同一である。□</w:t>
+      </w:r>
+    </w:p>
+    <w:p>
+      <w:pPr/>
+      <w:r>
+        <w:rPr>
           <w:b/>
           <w:i/>
         </w:rPr>
@@ -4057,6 +4067,16 @@
       </w:r>
     </w:p>
     <w:p>
+      <w:pPr/>
+      <w:r>
+        <w:rPr>
+          <w:b w:val="0"/>
+          <w:i/>
+        </w:rPr>
+        <w:t>証明: α=0 ではユーティリティ関数は U(i,j) = D_DPI(i→j) に帰着。定理 10.1 により、各DPI成分はANM仮定下で識別可能であり (命題 4.1)、Ā(i,j) ≠ 0 が真の因果辺に対し正しい符号で成立する。したがって D_DPI(i→j) ≠ D_DPI(j→i) であり、ドメイン知識なしに非対称ユーティリティグラフが定義可能。□</w:t>
+      </w:r>
+    </w:p>
+    <w:p>
       <w:pPr>
         <w:pStyle w:val="Heading2"/>
       </w:pPr>

</xml_diff>

<commit_message>
Redistribute figures: A1 keeps 4 theory figures, remove 5 application figures to A2
A1 (JMLR theory) now has:
- Figure 1: fig1_three_approaches.png (new, added to intro)
- Figure 2: fig2_magnetic_laplacian_q.png (magnetic Laplacian eigenvectors)
- Figure 3: fig3_hodge_decomposition.png (Hodge decomposition)
- Figure 4: fig8_alpha_sweep.png (alpha-sweep phase transition)

Removed from A1 (moved to A2 applied paper):
- fig4_direction_comparison.png
- fig5_hill_radar.png
- fig6_causal_dag.png
- fig7_lingam_vs_spectral.png
- fig9_ecd_pruning_analysis.png

Updated: LaTeX cross-references, docx generator, pptx generator.
Regenerated: spectral_causality_ja.docx (4 figures), spectral_causality_figures.pptx (4 slides).
LaTeX compiles cleanly: 23 pages, 0 undefined references.

Co-Authored-By: Tatsuki Onishi <bougtoir@gmail.com>
</commit_message>
<xml_diff>
--- a/spectral-causality-jmlr/spectral_causality_ja.docx
+++ b/spectral-causality-jmlr/spectral_causality_ja.docx
@@ -195,6 +195,68 @@
         <w:t>(4) DPIの部分的識別可能性: ANM下でDPIのANM成分が n→∞ で因果方向を整合的に識別することを証明（第10節）。</w:t>
         <w:br/>
         <w:t>(5) Ensemble Causal Direction (ECD): LiNGAMの局所的識別可能性とスペクトル因果性の大域的構造解析を統合するパイプライン（第9節）。</w:t>
+      </w:r>
+    </w:p>
+    <w:p>
+      <w:pPr/>
+      <w:r>
+        <w:rPr>
+          <w:b w:val="0"/>
+          <w:i w:val="0"/>
+        </w:rPr>
+        <w:t>図1に本研究で統合する3つの相補的アプローチの概念概要を示す。</w:t>
+      </w:r>
+    </w:p>
+    <w:p>
+      <w:pPr>
+        <w:jc w:val="center"/>
+      </w:pPr>
+      <w:r>
+        <w:drawing>
+          <wp:inline xmlns:a="http://schemas.openxmlformats.org/drawingml/2006/main" xmlns:pic="http://schemas.openxmlformats.org/drawingml/2006/picture">
+            <wp:extent cx="5029200" cy="1652050"/>
+            <wp:docPr id="1" name="Picture 1"/>
+            <wp:cNvGraphicFramePr>
+              <a:graphicFrameLocks noChangeAspect="1"/>
+            </wp:cNvGraphicFramePr>
+            <a:graphic>
+              <a:graphicData uri="http://schemas.openxmlformats.org/drawingml/2006/picture">
+                <pic:pic>
+                  <pic:nvPicPr>
+                    <pic:cNvPr id="0" name="fig1_three_approaches.png"/>
+                    <pic:cNvPicPr/>
+                  </pic:nvPicPr>
+                  <pic:blipFill>
+                    <a:blip r:embed="rId9"/>
+                    <a:stretch>
+                      <a:fillRect/>
+                    </a:stretch>
+                  </pic:blipFill>
+                  <pic:spPr>
+                    <a:xfrm>
+                      <a:off x="0" y="0"/>
+                      <a:ext cx="5029200" cy="1652050"/>
+                    </a:xfrm>
+                    <a:prstGeom prst="rect"/>
+                  </pic:spPr>
+                </pic:pic>
+              </a:graphicData>
+            </a:graphic>
+          </wp:inline>
+        </w:drawing>
+      </w:r>
+    </w:p>
+    <w:p>
+      <w:pPr>
+        <w:spacing w:before="120" w:after="240"/>
+        <w:jc w:val="center"/>
+      </w:pPr>
+      <w:r>
+        <w:rPr>
+          <w:i/>
+          <w:sz w:val="18"/>
+        </w:rPr>
+        <w:t>図1: 因果推論への3つの相補的アプローチ: (1) 構造方程式モデルとDAGベース手法 (例: LiNGAM)、(2) 磁気ラプラシアンによるスペクトルグラフ手法、(3) Hodge理論的フロー分解。スペクトル因果性は(2) と(3) を統合する。</w:t>
       </w:r>
     </w:p>
     <w:p>
@@ -1276,59 +1338,7 @@
         <w:br/>
         <w:t>X_1 ≺ X_4 ≺ X_5 ≺ X_2 ≺ X_3 (年齢→最大心拍数→ST低下→安静時血圧→コレステロール)</w:t>
         <w:br/>
-        <w:t>主要因果効果: B_{42} = -0.395 (年齢→最大心拍数)、B_{21} = +0.309 (年齢→安静時血圧)、B_{54} = -0.348 (最大心拍数→ST低下)。図1にDirectLiNGAMで推定された因果DAGを示す。</w:t>
-      </w:r>
-    </w:p>
-    <w:p>
-      <w:pPr>
-        <w:jc w:val="center"/>
-      </w:pPr>
-      <w:r>
-        <w:drawing>
-          <wp:inline xmlns:a="http://schemas.openxmlformats.org/drawingml/2006/main" xmlns:pic="http://schemas.openxmlformats.org/drawingml/2006/picture">
-            <wp:extent cx="3657600" cy="3998468"/>
-            <wp:docPr id="1" name="Picture 1"/>
-            <wp:cNvGraphicFramePr>
-              <a:graphicFrameLocks noChangeAspect="1"/>
-            </wp:cNvGraphicFramePr>
-            <a:graphic>
-              <a:graphicData uri="http://schemas.openxmlformats.org/drawingml/2006/picture">
-                <pic:pic>
-                  <pic:nvPicPr>
-                    <pic:cNvPr id="0" name="fig6_causal_dag.png"/>
-                    <pic:cNvPicPr/>
-                  </pic:nvPicPr>
-                  <pic:blipFill>
-                    <a:blip r:embed="rId9"/>
-                    <a:stretch>
-                      <a:fillRect/>
-                    </a:stretch>
-                  </pic:blipFill>
-                  <pic:spPr>
-                    <a:xfrm>
-                      <a:off x="0" y="0"/>
-                      <a:ext cx="3657600" cy="3998468"/>
-                    </a:xfrm>
-                    <a:prstGeom prst="rect"/>
-                  </pic:spPr>
-                </pic:pic>
-              </a:graphicData>
-            </a:graphic>
-          </wp:inline>
-        </w:drawing>
-      </w:r>
-    </w:p>
-    <w:p>
-      <w:pPr>
-        <w:spacing w:before="120" w:after="240"/>
-        <w:jc w:val="center"/>
-      </w:pPr>
-      <w:r>
-        <w:rPr>
-          <w:i/>
-          <w:sz w:val="18"/>
-        </w:rPr>
-        <w:t>図1: DirectLiNGAM推定因果DAG (UCI心疾患データ, N=297, 臨床変数5個)。青い辺は正の因果効果、赤い辺は負の因果効果を示す。年齢が最上流変数。</w:t>
+        <w:t>主要因果効果: B_{42} = -0.395 (年齢→最大心拍数)、B_{21} = +0.309 (年齢→安静時血圧)、B_{54} = -0.348 (最大心拍数→ST低下)。</w:t>
       </w:r>
     </w:p>
     <w:p>
@@ -2064,59 +2074,7 @@
           <w:b w:val="0"/>
           <w:i w:val="0"/>
         </w:rPr>
-        <w:t>全 C(5,2)=10 変数ペアについてLiNGAM, SCD, Hodgeポテンシャルの因果方向を比較すると、一致と情報を含む不一致の両方が明らかになる (図4)。</w:t>
-      </w:r>
-    </w:p>
-    <w:p>
-      <w:pPr>
-        <w:jc w:val="center"/>
-      </w:pPr>
-      <w:r>
-        <w:drawing>
-          <wp:inline xmlns:a="http://schemas.openxmlformats.org/drawingml/2006/main" xmlns:pic="http://schemas.openxmlformats.org/drawingml/2006/picture">
-            <wp:extent cx="5029200" cy="2515806"/>
-            <wp:docPr id="4" name="Picture 4"/>
-            <wp:cNvGraphicFramePr>
-              <a:graphicFrameLocks noChangeAspect="1"/>
-            </wp:cNvGraphicFramePr>
-            <a:graphic>
-              <a:graphicData uri="http://schemas.openxmlformats.org/drawingml/2006/picture">
-                <pic:pic>
-                  <pic:nvPicPr>
-                    <pic:cNvPr id="0" name="fig4_direction_comparison.png"/>
-                    <pic:cNvPicPr/>
-                  </pic:nvPicPr>
-                  <pic:blipFill>
-                    <a:blip r:embed="rId12"/>
-                    <a:stretch>
-                      <a:fillRect/>
-                    </a:stretch>
-                  </pic:blipFill>
-                  <pic:spPr>
-                    <a:xfrm>
-                      <a:off x="0" y="0"/>
-                      <a:ext cx="5029200" cy="2515806"/>
-                    </a:xfrm>
-                    <a:prstGeom prst="rect"/>
-                  </pic:spPr>
-                </pic:pic>
-              </a:graphicData>
-            </a:graphic>
-          </wp:inline>
-        </w:drawing>
-      </w:r>
-    </w:p>
-    <w:p>
-      <w:pPr>
-        <w:spacing w:before="120" w:after="240"/>
-        <w:jc w:val="center"/>
-      </w:pPr>
-      <w:r>
-        <w:rPr>
-          <w:i/>
-          <w:sz w:val="18"/>
-        </w:rPr>
-        <w:t>図4: 全10変数ペアの因果方向比較。LiNGAM (赤), SCD (青), Hodgeポテンシャル (緑)。+1: 第1変数→第2変数; -1: 逆。緑背景: 3手法全てが一致。</w:t>
+        <w:t>全 C(5,2)=10 変数ペアについてLiNGAM, SCD, Hodgeポテンシャルの因果方向を比較すると、一致と情報を含む不一致の両方が明らかになる。</w:t>
       </w:r>
     </w:p>
     <w:p>
@@ -2391,59 +2349,7 @@
           <w:b w:val="0"/>
           <w:i w:val="0"/>
         </w:rPr>
-        <w:t>条件 (C) はDPIによりα=0で9本の有向辺を検出し、r_gradient = 0.581、LiNGAMとの方向一致率67%。α=0からα=0.6への遷移で r_gradient は0.581から0.824に滑らかに改善 (図5)。</w:t>
-      </w:r>
-    </w:p>
-    <w:p>
-      <w:pPr>
-        <w:jc w:val="center"/>
-      </w:pPr>
-      <w:r>
-        <w:drawing>
-          <wp:inline xmlns:a="http://schemas.openxmlformats.org/drawingml/2006/main" xmlns:pic="http://schemas.openxmlformats.org/drawingml/2006/picture">
-            <wp:extent cx="5029200" cy="2187657"/>
-            <wp:docPr id="5" name="Picture 5"/>
-            <wp:cNvGraphicFramePr>
-              <a:graphicFrameLocks noChangeAspect="1"/>
-            </wp:cNvGraphicFramePr>
-            <a:graphic>
-              <a:graphicData uri="http://schemas.openxmlformats.org/drawingml/2006/picture">
-                <pic:pic>
-                  <pic:nvPicPr>
-                    <pic:cNvPr id="0" name="fig7_lingam_vs_spectral.png"/>
-                    <pic:cNvPicPr/>
-                  </pic:nvPicPr>
-                  <pic:blipFill>
-                    <a:blip r:embed="rId13"/>
-                    <a:stretch>
-                      <a:fillRect/>
-                    </a:stretch>
-                  </pic:blipFill>
-                  <pic:spPr>
-                    <a:xfrm>
-                      <a:off x="0" y="0"/>
-                      <a:ext cx="5029200" cy="2187657"/>
-                    </a:xfrm>
-                    <a:prstGeom prst="rect"/>
-                  </pic:spPr>
-                </pic:pic>
-              </a:graphicData>
-            </a:graphic>
-          </wp:inline>
-        </w:drawing>
-      </w:r>
-    </w:p>
-    <w:p>
-      <w:pPr>
-        <w:spacing w:before="120" w:after="240"/>
-        <w:jc w:val="center"/>
-      </w:pPr>
-      <w:r>
-        <w:rPr>
-          <w:i/>
-          <w:sz w:val="18"/>
-        </w:rPr>
-        <w:t>図5: 三条件比較。(A) LiNGAM DAG (6辺)。(B) スペクトル因果性 α=0.6 (10有向辺, 巡回許容)。(C) スペクトル因果性 α=0 + DPI (9有向辺, ドメイン知識なし)。</w:t>
+        <w:t>条件 (C) はDPIによりα=0で9本の有向辺を検出し、r_gradient = 0.581、LiNGAMとの方向一致率67%。α=0からα=0.6への遷移で r_gradient は0.581から0.824に滑らかに改善。</w:t>
       </w:r>
     </w:p>
     <w:p>
@@ -2541,7 +2447,7 @@
           <w:b w:val="0"/>
           <w:i w:val="0"/>
         </w:rPr>
-        <w:t>DPIをデータ駆動成分とする場合、α=0 での反対称成分が非ゼロとなり r_gradient(0) = 0.581 &gt; 0。α=0 から α=1 への遷移は滑らかで、旧モデルの一次相転移に替わる二次相転移となる (図6)。</w:t>
+        <w:t>DPIをデータ駆動成分とする場合、α=0 での反対称成分が非ゼロとなり r_gradient(0) = 0.581 &gt; 0。α=0 から α=1 への遷移は滑らかで、旧モデルの一次相転移に替わる二次相転移となる (図4)。</w:t>
       </w:r>
     </w:p>
     <w:p>
@@ -2552,7 +2458,7 @@
         <w:drawing>
           <wp:inline xmlns:a="http://schemas.openxmlformats.org/drawingml/2006/main" xmlns:pic="http://schemas.openxmlformats.org/drawingml/2006/picture">
             <wp:extent cx="5029200" cy="3715183"/>
-            <wp:docPr id="6" name="Picture 6"/>
+            <wp:docPr id="4" name="Picture 4"/>
             <wp:cNvGraphicFramePr>
               <a:graphicFrameLocks noChangeAspect="1"/>
             </wp:cNvGraphicFramePr>
@@ -2564,7 +2470,7 @@
                     <pic:cNvPicPr/>
                   </pic:nvPicPr>
                   <pic:blipFill>
-                    <a:blip r:embed="rId14"/>
+                    <a:blip r:embed="rId12"/>
                     <a:stretch>
                       <a:fillRect/>
                     </a:stretch>
@@ -2593,7 +2499,7 @@
           <w:i/>
           <w:sz w:val="18"/>
         </w:rPr>
-        <w:t>図6: DPIによるα掃引解析。(A) r_gradient は0.581 (α=0) から0.859 (α=1) に滑らかに増加。(B) 検出辺数とLiNGAM一致率。(C) 非対称ノルム。(D) 相図。</w:t>
+        <w:t>図4: DPIによるα掃引解析。(A) r_gradient は0.581 (α=0) から0.859 (α=1) に滑らかに増加。(B) 検出辺数とLiNGAM一致率。(C) 非対称ノルム。(D) 相図。</w:t>
       </w:r>
     </w:p>
     <w:p>
@@ -3207,59 +3113,7 @@
           <w:b w:val="0"/>
           <w:i w:val="0"/>
         </w:rPr>
-        <w:t>因果ポテンシャル φ は臨床的介入可能性 ι との著しい対応を示す (図7):</w:t>
-      </w:r>
-    </w:p>
-    <w:p>
-      <w:pPr>
-        <w:jc w:val="center"/>
-      </w:pPr>
-      <w:r>
-        <w:drawing>
-          <wp:inline xmlns:a="http://schemas.openxmlformats.org/drawingml/2006/main" xmlns:pic="http://schemas.openxmlformats.org/drawingml/2006/picture">
-            <wp:extent cx="5029200" cy="4481653"/>
-            <wp:docPr id="7" name="Picture 7"/>
-            <wp:cNvGraphicFramePr>
-              <a:graphicFrameLocks noChangeAspect="1"/>
-            </wp:cNvGraphicFramePr>
-            <a:graphic>
-              <a:graphicData uri="http://schemas.openxmlformats.org/drawingml/2006/picture">
-                <pic:pic>
-                  <pic:nvPicPr>
-                    <pic:cNvPr id="0" name="fig9_ecd_pruning_analysis.png"/>
-                    <pic:cNvPicPr/>
-                  </pic:nvPicPr>
-                  <pic:blipFill>
-                    <a:blip r:embed="rId15"/>
-                    <a:stretch>
-                      <a:fillRect/>
-                    </a:stretch>
-                  </pic:blipFill>
-                  <pic:spPr>
-                    <a:xfrm>
-                      <a:off x="0" y="0"/>
-                      <a:ext cx="5029200" cy="4481653"/>
-                    </a:xfrm>
-                    <a:prstGeom prst="rect"/>
-                  </pic:spPr>
-                </pic:pic>
-              </a:graphicData>
-            </a:graphic>
-          </wp:inline>
-        </w:drawing>
-      </w:r>
-    </w:p>
-    <w:p>
-      <w:pPr>
-        <w:spacing w:before="120" w:after="240"/>
-        <w:jc w:val="center"/>
-      </w:pPr>
-      <w:r>
-        <w:rPr>
-          <w:i/>
-          <w:sz w:val="18"/>
-        </w:rPr>
-        <w:t>図7: ECDパイプライン解析。(A) ECDフローのHodge分解。(B) 因果ポテンシャル φ vs 介入可能性 ι。(C) 辺ごとのフィードバック率。(D) 知識品質 p_flip vs r_gradient のU字型カーブ。</w:t>
+        <w:t>因果ポテンシャル φ は臨床的介入可能性 ι との著しい対応を示す:</w:t>
       </w:r>
     </w:p>
     <w:p>
@@ -3662,59 +3516,7 @@
           <w:b w:val="0"/>
           <w:i w:val="0"/>
         </w:rPr>
-        <w:t>単一の計算手法ではHillの因果判定9基準すべてをカバーできない (Hill, 1965)。ECDアンサンブルは大幅に広いカバレッジを達成する (図8)。</w:t>
-      </w:r>
-    </w:p>
-    <w:p>
-      <w:pPr>
-        <w:jc w:val="center"/>
-      </w:pPr>
-      <w:r>
-        <w:drawing>
-          <wp:inline xmlns:a="http://schemas.openxmlformats.org/drawingml/2006/main" xmlns:pic="http://schemas.openxmlformats.org/drawingml/2006/picture">
-            <wp:extent cx="3657600" cy="1319314"/>
-            <wp:docPr id="8" name="Picture 8"/>
-            <wp:cNvGraphicFramePr>
-              <a:graphicFrameLocks noChangeAspect="1"/>
-            </wp:cNvGraphicFramePr>
-            <a:graphic>
-              <a:graphicData uri="http://schemas.openxmlformats.org/drawingml/2006/picture">
-                <pic:pic>
-                  <pic:nvPicPr>
-                    <pic:cNvPr id="0" name="fig5_hill_radar.png"/>
-                    <pic:cNvPicPr/>
-                  </pic:nvPicPr>
-                  <pic:blipFill>
-                    <a:blip r:embed="rId16"/>
-                    <a:stretch>
-                      <a:fillRect/>
-                    </a:stretch>
-                  </pic:blipFill>
-                  <pic:spPr>
-                    <a:xfrm>
-                      <a:off x="0" y="0"/>
-                      <a:ext cx="3657600" cy="1319314"/>
-                    </a:xfrm>
-                    <a:prstGeom prst="rect"/>
-                  </pic:spPr>
-                </pic:pic>
-              </a:graphicData>
-            </a:graphic>
-          </wp:inline>
-        </w:drawing>
-      </w:r>
-    </w:p>
-    <w:p>
-      <w:pPr>
-        <w:spacing w:before="120" w:after="240"/>
-        <w:jc w:val="center"/>
-      </w:pPr>
-      <w:r>
-        <w:rPr>
-          <w:i/>
-          <w:sz w:val="18"/>
-        </w:rPr>
-        <w:t>図8: Hillの9基準カバレッジ。LiNGAMはH1 (強さ) とH3 (特異性) をカバーするがH6/H7/H9は欠如。スペクトル因果性はユーティリティ関数を通じてH6 (妥当性), H7 (整合性), H9 (類似性) をカバー。ECDアンサンブルは両方を統合し、ほぼ完全なカバレッジを達成。</w:t>
+        <w:t>単一の計算手法ではHillの因果判定9基準すべてをカバーできない (Hill, 1965)。ECDアンサンブルは大幅に広いカバレッジを達成する。具体的にはLiNGAMはH1 (強さ) とH3 (特異性) をカバーするがH6/H7/H9は欠如。スペクトル因果性はユーティリティ関数を通じてH6 (妥当性), H7 (整合性), H9 (類似性) をカバーし、ECDアンサンブルは両方を統合しほぼ完全なカバレッジを達成する。</w:t>
       </w:r>
     </w:p>
     <w:p>

</xml_diff>

<commit_message>
Add 3 new figures from session 2f832eb3: DPI architecture, CCI complex plane, p_flip U-curve
- A1 now has 7 figures (existing 4 + 3 new), renumbered by document order
- fig_dpi_architecture.png: DPI modular architecture block diagram (§4.2)
- fig_cci_complex_plane.png: CCI variable pairs in complex plane (§4.4)
- fig_pflip_ucurve.png: knowledge quality phase transition U-curve (§8.2)
- LaTeX: 25 pages, 0 undefined references, 7 figures with text citations
- docx/pptx: regenerated with sequential numbering (Fig 1-7)
- All figures cited in text before placement per JMLR requirements

Co-Authored-By: Tatsuki Onishi <bougtoir@gmail.com>
</commit_message>
<xml_diff>
--- a/spectral-causality-jmlr/spectral_causality_ja.docx
+++ b/spectral-causality-jmlr/spectral_causality_ja.docx
@@ -830,6 +830,58 @@
     </w:p>
     <w:p>
       <w:pPr>
+        <w:jc w:val="center"/>
+      </w:pPr>
+      <w:r>
+        <w:drawing>
+          <wp:inline xmlns:a="http://schemas.openxmlformats.org/drawingml/2006/main" xmlns:pic="http://schemas.openxmlformats.org/drawingml/2006/picture">
+            <wp:extent cx="5029200" cy="2859351"/>
+            <wp:docPr id="2" name="Picture 2"/>
+            <wp:cNvGraphicFramePr>
+              <a:graphicFrameLocks noChangeAspect="1"/>
+            </wp:cNvGraphicFramePr>
+            <a:graphic>
+              <a:graphicData uri="http://schemas.openxmlformats.org/drawingml/2006/picture">
+                <pic:pic>
+                  <pic:nvPicPr>
+                    <pic:cNvPr id="0" name="fig_dpi_architecture.png"/>
+                    <pic:cNvPicPr/>
+                  </pic:nvPicPr>
+                  <pic:blipFill>
+                    <a:blip r:embed="rId10"/>
+                    <a:stretch>
+                      <a:fillRect/>
+                    </a:stretch>
+                  </pic:blipFill>
+                  <pic:spPr>
+                    <a:xfrm>
+                      <a:off x="0" y="0"/>
+                      <a:ext cx="5029200" cy="2859351"/>
+                    </a:xfrm>
+                    <a:prstGeom prst="rect"/>
+                  </pic:spPr>
+                </pic:pic>
+              </a:graphicData>
+            </a:graphic>
+          </wp:inline>
+        </w:drawing>
+      </w:r>
+    </w:p>
+    <w:p>
+      <w:pPr>
+        <w:spacing w:before="120" w:after="240"/>
+        <w:jc w:val="center"/>
+      </w:pPr>
+      <w:r>
+        <w:rPr>
+          <w:i/>
+          <w:sz w:val="18"/>
+        </w:rPr>
+        <w:t>図2: Directional Predictability Index (DPI) のアーキテクチャ。3つの独立な非対称統計量（回帰係数非対称性 Â_reg、ANM残差独立性 Â_ANM、条件付きエントロピー削減 Â_ent）を正規化・平均し、対称相関 |ρ_{ij}| を非対称DPIスコアに変換する。モジュラー設計により各成分を独立に拡張可能。</w:t>
+      </w:r>
+    </w:p>
+    <w:p>
+      <w:pPr>
         <w:pStyle w:val="Heading2"/>
       </w:pPr>
       <w:r>
@@ -868,6 +920,58 @@
           <w:i w:val="0"/>
         </w:rPr>
         <w:t>CCI(i,j) = Σ_k f(λ_k) |u_k(i)| |u_k(j)| exp(i(θ_k(i) - θ_k(j))) と定義すると、SCC(i,j) = Re[CCI(i,j)]、SCD(i,j) = Im[CCI(i,j)] が成り立つ。</w:t>
+      </w:r>
+    </w:p>
+    <w:p>
+      <w:pPr>
+        <w:jc w:val="center"/>
+      </w:pPr>
+      <w:r>
+        <w:drawing>
+          <wp:inline xmlns:a="http://schemas.openxmlformats.org/drawingml/2006/main" xmlns:pic="http://schemas.openxmlformats.org/drawingml/2006/picture">
+            <wp:extent cx="5029200" cy="4176901"/>
+            <wp:docPr id="3" name="Picture 3"/>
+            <wp:cNvGraphicFramePr>
+              <a:graphicFrameLocks noChangeAspect="1"/>
+            </wp:cNvGraphicFramePr>
+            <a:graphic>
+              <a:graphicData uri="http://schemas.openxmlformats.org/drawingml/2006/picture">
+                <pic:pic>
+                  <pic:nvPicPr>
+                    <pic:cNvPr id="0" name="fig_cci_complex_plane.png"/>
+                    <pic:cNvPicPr/>
+                  </pic:nvPicPr>
+                  <pic:blipFill>
+                    <a:blip r:embed="rId11"/>
+                    <a:stretch>
+                      <a:fillRect/>
+                    </a:stretch>
+                  </pic:blipFill>
+                  <pic:spPr>
+                    <a:xfrm>
+                      <a:off x="0" y="0"/>
+                      <a:ext cx="5029200" cy="4176901"/>
+                    </a:xfrm>
+                    <a:prstGeom prst="rect"/>
+                  </pic:spPr>
+                </pic:pic>
+              </a:graphicData>
+            </a:graphic>
+          </wp:inline>
+        </w:drawing>
+      </w:r>
+    </w:p>
+    <w:p>
+      <w:pPr>
+        <w:spacing w:before="120" w:after="240"/>
+        <w:jc w:val="center"/>
+      </w:pPr>
+      <w:r>
+        <w:rPr>
+          <w:i/>
+          <w:sz w:val="18"/>
+        </w:rPr>
+        <w:t>図3: 複素因果指標 CCI(i,j) の複素平面プロット。実軸 (SCC) は結合強度、虚軸 (SCD) は因果方向を表す。赤点は順方向 (i→j)、青点は逆方向を示す。大多数のペアが下半平面に集中し、Ageの上流ルートノードとしての優位性を反映。</w:t>
       </w:r>
     </w:p>
     <w:p>
@@ -1643,7 +1747,7 @@
           <w:b w:val="0"/>
           <w:i w:val="0"/>
         </w:rPr>
-        <w:t>図2は固有ベクトル成分の複素平面分布を示し、q の増加により上流ノードと下流ノードが分離される。</w:t>
+        <w:t>図4は固有ベクトル成分の複素平面分布を示し、q の増加により上流ノードと下流ノードが分離される。</w:t>
       </w:r>
     </w:p>
     <w:p>
@@ -1654,7 +1758,7 @@
         <w:drawing>
           <wp:inline xmlns:a="http://schemas.openxmlformats.org/drawingml/2006/main" xmlns:pic="http://schemas.openxmlformats.org/drawingml/2006/picture">
             <wp:extent cx="4572000" cy="1456729"/>
-            <wp:docPr id="2" name="Picture 2"/>
+            <wp:docPr id="4" name="Picture 4"/>
             <wp:cNvGraphicFramePr>
               <a:graphicFrameLocks noChangeAspect="1"/>
             </wp:cNvGraphicFramePr>
@@ -1666,7 +1770,7 @@
                     <pic:cNvPicPr/>
                   </pic:nvPicPr>
                   <pic:blipFill>
-                    <a:blip r:embed="rId10"/>
+                    <a:blip r:embed="rId12"/>
                     <a:stretch>
                       <a:fillRect/>
                     </a:stretch>
@@ -1695,7 +1799,7 @@
           <w:i/>
           <w:sz w:val="18"/>
         </w:rPr>
-        <w:t>図2: 磁気ラプラシアンのFiedler固有ベクトルの複素平面プロット (q=0, 0.1, 0.25)。q=0 では全点が実軸上。q の増加に伴い変数が複素平面に展開し、位相角順序が因果フロー方向を反映。</w:t>
+        <w:t>図4: 磁気ラプラシアンのFiedler固有ベクトルの複素平面プロット (q=0, 0.1, 0.25)。q=0 では全点が実軸上。q の増加に伴い変数が複素平面に展開し、位相角順序が因果フロー方向を反映。</w:t>
       </w:r>
     </w:p>
     <w:p>
@@ -1719,7 +1823,7 @@
         <w:br/>
         <w:t>||δ_1* ψ||^2 / ||ω||^2 = 14.1% (回転 = フィードバックループ)</w:t>
         <w:br/>
-        <w:t>r_gradient = 85.9% は主にDAG的構造を示す (図3)。</w:t>
+        <w:t>r_gradient = 85.9% は主にDAG的構造を示す (図5)。</w:t>
       </w:r>
     </w:p>
     <w:p>
@@ -1730,7 +1834,7 @@
         <w:drawing>
           <wp:inline xmlns:a="http://schemas.openxmlformats.org/drawingml/2006/main" xmlns:pic="http://schemas.openxmlformats.org/drawingml/2006/picture">
             <wp:extent cx="5029200" cy="2185959"/>
-            <wp:docPr id="3" name="Picture 3"/>
+            <wp:docPr id="5" name="Picture 5"/>
             <wp:cNvGraphicFramePr>
               <a:graphicFrameLocks noChangeAspect="1"/>
             </wp:cNvGraphicFramePr>
@@ -1742,7 +1846,7 @@
                     <pic:cNvPicPr/>
                   </pic:nvPicPr>
                   <pic:blipFill>
-                    <a:blip r:embed="rId11"/>
+                    <a:blip r:embed="rId13"/>
                     <a:stretch>
                       <a:fillRect/>
                     </a:stretch>
@@ -1771,7 +1875,7 @@
           <w:i/>
           <w:sz w:val="18"/>
         </w:rPr>
-        <w:t>図3: Hodge分解結果。(A) フローエネルギーの85.9%が勾配 (DAG) 成分、14.1%が回転 (フィードバック) 成分。(B) 因果ポテンシャル φ: 年齢が最上流、ST低下が最下流。</w:t>
+        <w:t>図5: Hodge分解結果。(A) フローエネルギーの85.9%が勾配 (DAG) 成分、14.1%が回転 (フィードバック) 成分。(B) 因果ポテンシャル φ: 年齢が最上流、ST低下が最下流。</w:t>
       </w:r>
     </w:p>
     <w:p>
@@ -2447,7 +2551,7 @@
           <w:b w:val="0"/>
           <w:i w:val="0"/>
         </w:rPr>
-        <w:t>DPIをデータ駆動成分とする場合、α=0 での反対称成分が非ゼロとなり r_gradient(0) = 0.581 &gt; 0。α=0 から α=1 への遷移は滑らかで、旧モデルの一次相転移に替わる二次相転移となる (図4)。</w:t>
+        <w:t>DPIをデータ駆動成分とする場合、α=0 での反対称成分が非ゼロとなり r_gradient(0) = 0.581 &gt; 0。α=0 から α=1 への遷移は滑らかで、旧モデルの一次相転移に替わる二次相転移となる (図6)。</w:t>
       </w:r>
     </w:p>
     <w:p>
@@ -2458,7 +2562,7 @@
         <w:drawing>
           <wp:inline xmlns:a="http://schemas.openxmlformats.org/drawingml/2006/main" xmlns:pic="http://schemas.openxmlformats.org/drawingml/2006/picture">
             <wp:extent cx="5029200" cy="3715183"/>
-            <wp:docPr id="4" name="Picture 4"/>
+            <wp:docPr id="6" name="Picture 6"/>
             <wp:cNvGraphicFramePr>
               <a:graphicFrameLocks noChangeAspect="1"/>
             </wp:cNvGraphicFramePr>
@@ -2470,7 +2574,7 @@
                     <pic:cNvPicPr/>
                   </pic:nvPicPr>
                   <pic:blipFill>
-                    <a:blip r:embed="rId12"/>
+                    <a:blip r:embed="rId14"/>
                     <a:stretch>
                       <a:fillRect/>
                     </a:stretch>
@@ -2499,7 +2603,7 @@
           <w:i/>
           <w:sz w:val="18"/>
         </w:rPr>
-        <w:t>図4: DPIによるα掃引解析。(A) r_gradient は0.581 (α=0) から0.859 (α=1) に滑らかに増加。(B) 検出辺数とLiNGAM一致率。(C) 非対称ノルム。(D) 相図。</w:t>
+        <w:t>図6: DPIによるα掃引解析。(A) r_gradient は0.581 (α=0) から0.859 (α=1) に滑らかに増加。(B) 検出辺数とLiNGAM一致率。(C) 非対称ノルム。(D) 相図。</w:t>
       </w:r>
     </w:p>
     <w:p>
@@ -2547,7 +2651,59 @@
           <w:b w:val="0"/>
           <w:i w:val="0"/>
         </w:rPr>
-        <w:t>DAG維持の臨界閾値 (r_gradient &gt; 0.5) は p_flip* ≈ 0.15: 辺方向の少なくとも85%が正しい必要がある。</w:t>
+        <w:t>DAG維持の臨界閾値 (r_gradient &gt; 0.5) は p_flip* ≈ 0.15: 辺方向の少なくとも85%が正しい必要がある (図7)。</w:t>
+      </w:r>
+    </w:p>
+    <w:p>
+      <w:pPr>
+        <w:jc w:val="center"/>
+      </w:pPr>
+      <w:r>
+        <w:drawing>
+          <wp:inline xmlns:a="http://schemas.openxmlformats.org/drawingml/2006/main" xmlns:pic="http://schemas.openxmlformats.org/drawingml/2006/picture">
+            <wp:extent cx="5029200" cy="2908632"/>
+            <wp:docPr id="7" name="Picture 7"/>
+            <wp:cNvGraphicFramePr>
+              <a:graphicFrameLocks noChangeAspect="1"/>
+            </wp:cNvGraphicFramePr>
+            <a:graphic>
+              <a:graphicData uri="http://schemas.openxmlformats.org/drawingml/2006/picture">
+                <pic:pic>
+                  <pic:nvPicPr>
+                    <pic:cNvPr id="0" name="fig_pflip_ucurve.png"/>
+                    <pic:cNvPicPr/>
+                  </pic:nvPicPr>
+                  <pic:blipFill>
+                    <a:blip r:embed="rId15"/>
+                    <a:stretch>
+                      <a:fillRect/>
+                    </a:stretch>
+                  </pic:blipFill>
+                  <pic:spPr>
+                    <a:xfrm>
+                      <a:off x="0" y="0"/>
+                      <a:ext cx="5029200" cy="2908632"/>
+                    </a:xfrm>
+                    <a:prstGeom prst="rect"/>
+                  </pic:spPr>
+                </pic:pic>
+              </a:graphicData>
+            </a:graphic>
+          </wp:inline>
+        </w:drawing>
+      </w:r>
+    </w:p>
+    <w:p>
+      <w:pPr>
+        <w:spacing w:before="120" w:after="240"/>
+        <w:jc w:val="center"/>
+      </w:pPr>
+      <w:r>
+        <w:rPr>
+          <w:i/>
+          <w:sz w:val="18"/>
+        </w:rPr>
+        <w:t>図7: 知識品質の相転移（定理8.2）。辺方向反転率 p_flip の増加に伴い、勾配エネルギー比 r_gradient はU字型カーブを描く。理論予測 (1-2p)^2 r*（赤破線）は完全対称な反転を仮定。実測値（青、200試行、α=0.6）はDPIデータ駆動成分（40%重み）が不変のため乖離し、p=0.5でr_gradientはゼロに到達しない。臨界閾値 p*_flip ≈ 0.15 以下でDAG構造が維持される。</w:t>
       </w:r>
     </w:p>
     <w:p>

</xml_diff>

<commit_message>
Fix figure quality: CCI X-axis scale (q=0.25→0.15) + label overlap in fig3/fig4
- Fig 3 (CCI complex plane): Use q=0.15 instead of 0.25 to get non-degenerate
  SCC values (at q=0.25, cos(pi/2)=0 makes SCC identically zero)
- Fig 3: Labels moved to right side with arrows, sorted by SCD, no overlap
- Fig 4 (magnetic laplacian): Increased margins and staggered label offsets
- Added regenerate_figures.py for reproducible figure generation
- Updated LaTeX caption to document q=0.15 and describe SCC/SCD pattern

Co-Authored-By: Tatsuki Onishi <bougtoir@gmail.com>
</commit_message>
<xml_diff>
--- a/spectral-causality-jmlr/spectral_causality_ja.docx
+++ b/spectral-causality-jmlr/spectral_causality_ja.docx
@@ -929,7 +929,7 @@
       <w:r>
         <w:drawing>
           <wp:inline xmlns:a="http://schemas.openxmlformats.org/drawingml/2006/main" xmlns:pic="http://schemas.openxmlformats.org/drawingml/2006/picture">
-            <wp:extent cx="5029200" cy="4176901"/>
+            <wp:extent cx="5029200" cy="4505166"/>
             <wp:docPr id="3" name="Picture 3"/>
             <wp:cNvGraphicFramePr>
               <a:graphicFrameLocks noChangeAspect="1"/>
@@ -950,7 +950,7 @@
                   <pic:spPr>
                     <a:xfrm>
                       <a:off x="0" y="0"/>
-                      <a:ext cx="5029200" cy="4176901"/>
+                      <a:ext cx="5029200" cy="4505166"/>
                     </a:xfrm>
                     <a:prstGeom prst="rect"/>
                   </pic:spPr>
@@ -1757,7 +1757,7 @@
       <w:r>
         <w:drawing>
           <wp:inline xmlns:a="http://schemas.openxmlformats.org/drawingml/2006/main" xmlns:pic="http://schemas.openxmlformats.org/drawingml/2006/picture">
-            <wp:extent cx="4572000" cy="1456729"/>
+            <wp:extent cx="4572000" cy="1683589"/>
             <wp:docPr id="4" name="Picture 4"/>
             <wp:cNvGraphicFramePr>
               <a:graphicFrameLocks noChangeAspect="1"/>
@@ -1778,7 +1778,7 @@
                   <pic:spPr>
                     <a:xfrm>
                       <a:off x="0" y="0"/>
-                      <a:ext cx="4572000" cy="1456729"/>
+                      <a:ext cx="4572000" cy="1683589"/>
                     </a:xfrm>
                     <a:prstGeom prst="rect"/>
                   </pic:spPr>

</xml_diff>

<commit_message>
Address 6 editorial feedback items
1. Abstract: spell out DirectLiNGAM (Direct Linear Non-Gaussian Acyclic Model) at first mention
2. Contributions: swap items 4 and 5 to match section order (ECD §9 before identifiability §10)
3. Figure 2 (DPI architecture): fix arrowheads hidden behind boxes (shrinkA/shrinkB)
4. §4.2: add full definition of C_domain (domain knowledge matrix); §7.1: add Table (clinical knowledge matrix)
5. §7.5: align 3 compared methods (A/B/C) with §7.6 three-condition comparison
6. Remark 8.2: rename to 'A little learning is a dangerous thing' (生兵法は大怪我のもと)

Regenerate: docx (JA), pptx (EN), PDF (26pp), submission archive v3.
Co-Authored-By: Tatsuki Onishi <bougtoir@gmail.com>
</commit_message>
<xml_diff>
--- a/spectral-causality-jmlr/spectral_causality_ja.docx
+++ b/spectral-causality-jmlr/spectral_causality_ja.docx
@@ -87,7 +87,7 @@
           <w:b w:val="0"/>
           <w:i w:val="0"/>
         </w:rPr>
-        <w:t>UCI心疾患データセット (n=297, 臨床変数5個) での実験により、DPIを用いたスペクトル因果性はα=0 (ドメイン知識なし) で9本の有向辺を検出し、DirectLiNGAMと67%の方向一致を達成する。Hodge分解はDAGベース手法では不可視な臨床的に意味のあるフィードバックループを明らかにする。LiNGAMの識別可能性保証とスペクトル因果性のフィードバック定量化を統合するEnsemble Causal Direction (ECD) パイプラインを提案し、Hillの因果推論9基準の包括的カバレッジを達成する。</w:t>
+        <w:t>UCI心疾患データセット (n=297, 臨床変数5個) での実験により、DPIを用いたスペクトル因果性はα=0 (ドメイン知識なし) で9本の有向辺を検出し、Direct Linear Non-Gaussian Acyclic Model (DirectLiNGAM; Shimizu et al., 2011) と67%の方向一致を達成する。Hodge分解はDAGベース手法では不可視な臨床的に意味のあるフィードバックループを明らかにする。LiNGAMの識別可能性保証とスペクトル因果性のフィードバック定量化を統合するEnsemble Causal Direction (ECD) パイプラインを提案し、Hillの因果推論9基準の包括的カバレッジを達成する。</w:t>
       </w:r>
     </w:p>
     <w:p>
@@ -192,9 +192,9 @@
         <w:br/>
         <w:t>(3) スケール不変性定理: r_gradient がユーティリティ行列の非対称成分の構造 (符号パターン) のみに依存し、大きさには依存しないことを証明（第8節）。</w:t>
         <w:br/>
-        <w:t>(4) DPIの部分的識別可能性: ANM下でDPIのANM成分が n→∞ で因果方向を整合的に識別することを証明（第10節）。</w:t>
+        <w:t>(4) Ensemble Causal Direction (ECD): LiNGAMの局所的識別可能性とスペクトル因果性の大域的構造解析を統合するパイプライン（第9節）。</w:t>
         <w:br/>
-        <w:t>(5) Ensemble Causal Direction (ECD): LiNGAMの局所的識別可能性とスペクトル因果性の大域的構造解析を統合するパイプライン（第9節）。</w:t>
+        <w:t>(5) DPIの部分的識別可能性: ANM下でDPIのANM成分が n→∞ で因果方向を整合的に識別することを証明（第10節）。</w:t>
       </w:r>
     </w:p>
     <w:p>
@@ -825,7 +825,7 @@
         <w:br/>
         <w:t>U(i→j) = α · C_domain(i,j) + (1-α) · D_DPI(i→j)</w:t>
         <w:br/>
-        <w:t>ここで α ∈ [0,1] はドメイン知識の重みパラメータである。</w:t>
+        <w:t>ここで α ∈ [0,1] はドメイン知識の混合比率、C_domain(i,j) ∈ [0,1] はドメイン知識行列であり、変数 X_i が X_j に因果的影響を及ぼすと信じられる度合いを符号化する。情報源としては専門家評価、文献ベースの評定、または構造化オントロジーが利用可能である。二値隣接行列と異なり C_domain は段階的信頼度を許容し、非対称性 C_domain(i,j) ≠ C_domain(j,i) が方向的事前知識を符号化する。</w:t>
       </w:r>
     </w:p>
     <w:p>
@@ -835,7 +835,7 @@
       <w:r>
         <w:drawing>
           <wp:inline xmlns:a="http://schemas.openxmlformats.org/drawingml/2006/main" xmlns:pic="http://schemas.openxmlformats.org/drawingml/2006/picture">
-            <wp:extent cx="5029200" cy="2859351"/>
+            <wp:extent cx="5029200" cy="2951004"/>
             <wp:docPr id="2" name="Picture 2"/>
             <wp:cNvGraphicFramePr>
               <a:graphicFrameLocks noChangeAspect="1"/>
@@ -856,7 +856,7 @@
                   <pic:spPr>
                     <a:xfrm>
                       <a:off x="0" y="0"/>
-                      <a:ext cx="5029200" cy="2859351"/>
+                      <a:ext cx="5029200" cy="2951004"/>
                     </a:xfrm>
                     <a:prstGeom prst="rect"/>
                   </pic:spPr>
@@ -1424,6 +1424,541 @@
       </w:r>
     </w:p>
     <w:p>
+      <w:pPr/>
+      <w:r>
+        <w:rPr>
+          <w:b/>
+          <w:i w:val="0"/>
+        </w:rPr>
+        <w:t>ドメイン知識行列</w:t>
+      </w:r>
+    </w:p>
+    <w:p>
+      <w:pPr/>
+      <w:r>
+        <w:rPr>
+          <w:b w:val="0"/>
+          <w:i w:val="0"/>
+        </w:rPr>
+        <w:t>確立された心血管生理学に基づき C_domain を構築する (表7.0)。各要素 C_domain(i,j) ∈ [0,1] は変数 X_i が X_j に及ぼすと信じられる因果影響の強度を表し、医学文献 (Detrano et al., 1989) から導出した。例えば C_domain(年齢, 安静時血圧) = 0.6 は加齢に伴う動脈硬化と安静時血圧上昇の確立された効果を反映する。</w:t>
+      </w:r>
+    </w:p>
+    <w:p>
+      <w:pPr>
+        <w:spacing w:before="240"/>
+      </w:pPr>
+      <w:r>
+        <w:rPr>
+          <w:b/>
+          <w:sz w:val="18"/>
+        </w:rPr>
+        <w:t>表 7.0: UCI心疾患変数のドメイン知識行列 C_domain。要素 (i,j) は変数 i の変数 j への因果影響の強度を表す。非対称性 C(i,j) ≠ C(j,i) が方向的事前知識を符号化する。</w:t>
+      </w:r>
+    </w:p>
+    <w:tbl>
+      <w:tblPr>
+        <w:tblStyle w:val="TableGrid"/>
+        <w:tblW w:type="auto" w:w="0"/>
+        <w:jc w:val="center"/>
+        <w:tblLook w:firstColumn="1" w:firstRow="1" w:lastColumn="0" w:lastRow="0" w:noHBand="0" w:noVBand="1" w:val="04A0"/>
+      </w:tblPr>
+      <w:tblGrid>
+        <w:gridCol w:w="1440"/>
+        <w:gridCol w:w="1440"/>
+        <w:gridCol w:w="1440"/>
+        <w:gridCol w:w="1440"/>
+        <w:gridCol w:w="1440"/>
+        <w:gridCol w:w="1440"/>
+      </w:tblGrid>
+      <w:tr>
+        <w:tc>
+          <w:tcPr>
+            <w:tcW w:type="dxa" w:w="1440"/>
+          </w:tcPr>
+          <w:p>
+            <w:r>
+              <w:rPr>
+                <w:b/>
+                <w:sz w:val="18"/>
+              </w:rPr>
+              <w:t>C(i,j)</w:t>
+            </w:r>
+          </w:p>
+        </w:tc>
+        <w:tc>
+          <w:tcPr>
+            <w:tcW w:type="dxa" w:w="1440"/>
+          </w:tcPr>
+          <w:p>
+            <w:r>
+              <w:rPr>
+                <w:b/>
+                <w:sz w:val="18"/>
+              </w:rPr>
+              <w:t>年齢</w:t>
+            </w:r>
+          </w:p>
+        </w:tc>
+        <w:tc>
+          <w:tcPr>
+            <w:tcW w:type="dxa" w:w="1440"/>
+          </w:tcPr>
+          <w:p>
+            <w:r>
+              <w:rPr>
+                <w:b/>
+                <w:sz w:val="18"/>
+              </w:rPr>
+              <w:t>安静時BP</w:t>
+            </w:r>
+          </w:p>
+        </w:tc>
+        <w:tc>
+          <w:tcPr>
+            <w:tcW w:type="dxa" w:w="1440"/>
+          </w:tcPr>
+          <w:p>
+            <w:r>
+              <w:rPr>
+                <w:b/>
+                <w:sz w:val="18"/>
+              </w:rPr>
+              <w:t>コレステロール</w:t>
+            </w:r>
+          </w:p>
+        </w:tc>
+        <w:tc>
+          <w:tcPr>
+            <w:tcW w:type="dxa" w:w="1440"/>
+          </w:tcPr>
+          <w:p>
+            <w:r>
+              <w:rPr>
+                <w:b/>
+                <w:sz w:val="18"/>
+              </w:rPr>
+              <w:t>最大HR</w:t>
+            </w:r>
+          </w:p>
+        </w:tc>
+        <w:tc>
+          <w:tcPr>
+            <w:tcW w:type="dxa" w:w="1440"/>
+          </w:tcPr>
+          <w:p>
+            <w:r>
+              <w:rPr>
+                <w:b/>
+                <w:sz w:val="18"/>
+              </w:rPr>
+              <w:t>ST低下</w:t>
+            </w:r>
+          </w:p>
+        </w:tc>
+      </w:tr>
+      <w:tr>
+        <w:tc>
+          <w:tcPr>
+            <w:tcW w:type="dxa" w:w="1440"/>
+          </w:tcPr>
+          <w:p>
+            <w:r>
+              <w:rPr>
+                <w:sz w:val="18"/>
+              </w:rPr>
+              <w:t>年齢</w:t>
+            </w:r>
+          </w:p>
+        </w:tc>
+        <w:tc>
+          <w:tcPr>
+            <w:tcW w:type="dxa" w:w="1440"/>
+          </w:tcPr>
+          <w:p>
+            <w:r>
+              <w:rPr>
+                <w:sz w:val="18"/>
+              </w:rPr>
+              <w:t>---</w:t>
+            </w:r>
+          </w:p>
+        </w:tc>
+        <w:tc>
+          <w:tcPr>
+            <w:tcW w:type="dxa" w:w="1440"/>
+          </w:tcPr>
+          <w:p>
+            <w:r>
+              <w:rPr>
+                <w:sz w:val="18"/>
+              </w:rPr>
+              <w:t>0.6</w:t>
+            </w:r>
+          </w:p>
+        </w:tc>
+        <w:tc>
+          <w:tcPr>
+            <w:tcW w:type="dxa" w:w="1440"/>
+          </w:tcPr>
+          <w:p>
+            <w:r>
+              <w:rPr>
+                <w:sz w:val="18"/>
+              </w:rPr>
+              <w:t>0.4</w:t>
+            </w:r>
+          </w:p>
+        </w:tc>
+        <w:tc>
+          <w:tcPr>
+            <w:tcW w:type="dxa" w:w="1440"/>
+          </w:tcPr>
+          <w:p>
+            <w:r>
+              <w:rPr>
+                <w:sz w:val="18"/>
+              </w:rPr>
+              <w:t>0.5</w:t>
+            </w:r>
+          </w:p>
+        </w:tc>
+        <w:tc>
+          <w:tcPr>
+            <w:tcW w:type="dxa" w:w="1440"/>
+          </w:tcPr>
+          <w:p>
+            <w:r>
+              <w:rPr>
+                <w:sz w:val="18"/>
+              </w:rPr>
+              <w:t>0.3</w:t>
+            </w:r>
+          </w:p>
+        </w:tc>
+      </w:tr>
+      <w:tr>
+        <w:tc>
+          <w:tcPr>
+            <w:tcW w:type="dxa" w:w="1440"/>
+          </w:tcPr>
+          <w:p>
+            <w:r>
+              <w:rPr>
+                <w:sz w:val="18"/>
+              </w:rPr>
+              <w:t>安静時BP</w:t>
+            </w:r>
+          </w:p>
+        </w:tc>
+        <w:tc>
+          <w:tcPr>
+            <w:tcW w:type="dxa" w:w="1440"/>
+          </w:tcPr>
+          <w:p>
+            <w:r>
+              <w:rPr>
+                <w:sz w:val="18"/>
+              </w:rPr>
+              <w:t>0.1</w:t>
+            </w:r>
+          </w:p>
+        </w:tc>
+        <w:tc>
+          <w:tcPr>
+            <w:tcW w:type="dxa" w:w="1440"/>
+          </w:tcPr>
+          <w:p>
+            <w:r>
+              <w:rPr>
+                <w:sz w:val="18"/>
+              </w:rPr>
+              <w:t>---</w:t>
+            </w:r>
+          </w:p>
+        </w:tc>
+        <w:tc>
+          <w:tcPr>
+            <w:tcW w:type="dxa" w:w="1440"/>
+          </w:tcPr>
+          <w:p>
+            <w:r>
+              <w:rPr>
+                <w:sz w:val="18"/>
+              </w:rPr>
+              <w:t>0.2</w:t>
+            </w:r>
+          </w:p>
+        </w:tc>
+        <w:tc>
+          <w:tcPr>
+            <w:tcW w:type="dxa" w:w="1440"/>
+          </w:tcPr>
+          <w:p>
+            <w:r>
+              <w:rPr>
+                <w:sz w:val="18"/>
+              </w:rPr>
+              <w:t>0.3</w:t>
+            </w:r>
+          </w:p>
+        </w:tc>
+        <w:tc>
+          <w:tcPr>
+            <w:tcW w:type="dxa" w:w="1440"/>
+          </w:tcPr>
+          <w:p>
+            <w:r>
+              <w:rPr>
+                <w:sz w:val="18"/>
+              </w:rPr>
+              <w:t>0.4</w:t>
+            </w:r>
+          </w:p>
+        </w:tc>
+      </w:tr>
+      <w:tr>
+        <w:tc>
+          <w:tcPr>
+            <w:tcW w:type="dxa" w:w="1440"/>
+          </w:tcPr>
+          <w:p>
+            <w:r>
+              <w:rPr>
+                <w:sz w:val="18"/>
+              </w:rPr>
+              <w:t>コレステロール</w:t>
+            </w:r>
+          </w:p>
+        </w:tc>
+        <w:tc>
+          <w:tcPr>
+            <w:tcW w:type="dxa" w:w="1440"/>
+          </w:tcPr>
+          <w:p>
+            <w:r>
+              <w:rPr>
+                <w:sz w:val="18"/>
+              </w:rPr>
+              <w:t>0.1</w:t>
+            </w:r>
+          </w:p>
+        </w:tc>
+        <w:tc>
+          <w:tcPr>
+            <w:tcW w:type="dxa" w:w="1440"/>
+          </w:tcPr>
+          <w:p>
+            <w:r>
+              <w:rPr>
+                <w:sz w:val="18"/>
+              </w:rPr>
+              <w:t>0.3</w:t>
+            </w:r>
+          </w:p>
+        </w:tc>
+        <w:tc>
+          <w:tcPr>
+            <w:tcW w:type="dxa" w:w="1440"/>
+          </w:tcPr>
+          <w:p>
+            <w:r>
+              <w:rPr>
+                <w:sz w:val="18"/>
+              </w:rPr>
+              <w:t>---</w:t>
+            </w:r>
+          </w:p>
+        </w:tc>
+        <w:tc>
+          <w:tcPr>
+            <w:tcW w:type="dxa" w:w="1440"/>
+          </w:tcPr>
+          <w:p>
+            <w:r>
+              <w:rPr>
+                <w:sz w:val="18"/>
+              </w:rPr>
+              <w:t>0.1</w:t>
+            </w:r>
+          </w:p>
+        </w:tc>
+        <w:tc>
+          <w:tcPr>
+            <w:tcW w:type="dxa" w:w="1440"/>
+          </w:tcPr>
+          <w:p>
+            <w:r>
+              <w:rPr>
+                <w:sz w:val="18"/>
+              </w:rPr>
+              <w:t>0.3</w:t>
+            </w:r>
+          </w:p>
+        </w:tc>
+      </w:tr>
+      <w:tr>
+        <w:tc>
+          <w:tcPr>
+            <w:tcW w:type="dxa" w:w="1440"/>
+          </w:tcPr>
+          <w:p>
+            <w:r>
+              <w:rPr>
+                <w:sz w:val="18"/>
+              </w:rPr>
+              <w:t>最大HR</w:t>
+            </w:r>
+          </w:p>
+        </w:tc>
+        <w:tc>
+          <w:tcPr>
+            <w:tcW w:type="dxa" w:w="1440"/>
+          </w:tcPr>
+          <w:p>
+            <w:r>
+              <w:rPr>
+                <w:sz w:val="18"/>
+              </w:rPr>
+              <w:t>0.1</w:t>
+            </w:r>
+          </w:p>
+        </w:tc>
+        <w:tc>
+          <w:tcPr>
+            <w:tcW w:type="dxa" w:w="1440"/>
+          </w:tcPr>
+          <w:p>
+            <w:r>
+              <w:rPr>
+                <w:sz w:val="18"/>
+              </w:rPr>
+              <w:t>0.2</w:t>
+            </w:r>
+          </w:p>
+        </w:tc>
+        <w:tc>
+          <w:tcPr>
+            <w:tcW w:type="dxa" w:w="1440"/>
+          </w:tcPr>
+          <w:p>
+            <w:r>
+              <w:rPr>
+                <w:sz w:val="18"/>
+              </w:rPr>
+              <w:t>0.1</w:t>
+            </w:r>
+          </w:p>
+        </w:tc>
+        <w:tc>
+          <w:tcPr>
+            <w:tcW w:type="dxa" w:w="1440"/>
+          </w:tcPr>
+          <w:p>
+            <w:r>
+              <w:rPr>
+                <w:sz w:val="18"/>
+              </w:rPr>
+              <w:t>---</w:t>
+            </w:r>
+          </w:p>
+        </w:tc>
+        <w:tc>
+          <w:tcPr>
+            <w:tcW w:type="dxa" w:w="1440"/>
+          </w:tcPr>
+          <w:p>
+            <w:r>
+              <w:rPr>
+                <w:sz w:val="18"/>
+              </w:rPr>
+              <w:t>0.5</w:t>
+            </w:r>
+          </w:p>
+        </w:tc>
+      </w:tr>
+      <w:tr>
+        <w:tc>
+          <w:tcPr>
+            <w:tcW w:type="dxa" w:w="1440"/>
+          </w:tcPr>
+          <w:p>
+            <w:r>
+              <w:rPr>
+                <w:sz w:val="18"/>
+              </w:rPr>
+              <w:t>ST低下</w:t>
+            </w:r>
+          </w:p>
+        </w:tc>
+        <w:tc>
+          <w:tcPr>
+            <w:tcW w:type="dxa" w:w="1440"/>
+          </w:tcPr>
+          <w:p>
+            <w:r>
+              <w:rPr>
+                <w:sz w:val="18"/>
+              </w:rPr>
+              <w:t>0.0</w:t>
+            </w:r>
+          </w:p>
+        </w:tc>
+        <w:tc>
+          <w:tcPr>
+            <w:tcW w:type="dxa" w:w="1440"/>
+          </w:tcPr>
+          <w:p>
+            <w:r>
+              <w:rPr>
+                <w:sz w:val="18"/>
+              </w:rPr>
+              <w:t>0.1</w:t>
+            </w:r>
+          </w:p>
+        </w:tc>
+        <w:tc>
+          <w:tcPr>
+            <w:tcW w:type="dxa" w:w="1440"/>
+          </w:tcPr>
+          <w:p>
+            <w:r>
+              <w:rPr>
+                <w:sz w:val="18"/>
+              </w:rPr>
+              <w:t>0.0</w:t>
+            </w:r>
+          </w:p>
+        </w:tc>
+        <w:tc>
+          <w:tcPr>
+            <w:tcW w:type="dxa" w:w="1440"/>
+          </w:tcPr>
+          <w:p>
+            <w:r>
+              <w:rPr>
+                <w:sz w:val="18"/>
+              </w:rPr>
+              <w:t>0.2</w:t>
+            </w:r>
+          </w:p>
+        </w:tc>
+        <w:tc>
+          <w:tcPr>
+            <w:tcW w:type="dxa" w:w="1440"/>
+          </w:tcPr>
+          <w:p>
+            <w:r>
+              <w:rPr>
+                <w:sz w:val="18"/>
+              </w:rPr>
+              <w:t>---</w:t>
+            </w:r>
+          </w:p>
+        </w:tc>
+      </w:tr>
+    </w:tbl>
+    <w:p/>
+    <w:p>
       <w:pPr>
         <w:pStyle w:val="Heading2"/>
       </w:pPr>
@@ -1460,7 +1995,7 @@
           <w:b w:val="0"/>
           <w:i w:val="0"/>
         </w:rPr>
-        <w:t>α=0.6 (臨床知識60% + データ駆動DPI 40%) でユーティリティ有向グラフを構成し、q ∈ {0, 0.1, 0.25} で L^(q) を計算する。</w:t>
+        <w:t>式 (4) により α=0.6 で C_domain (表7.0) を60%の重み、データ駆動DPIを40%の重みで結合してユーティリティ有向グラフを構成し、q ∈ {0, 0.1, 0.25} で L^(q) を計算する。</w:t>
         <w:br/>
         <w:t>q=0 では全固有ベクトルは実数値で方向情報は利用不可。q=0.25 では固有ベクトルが複素数値となり、情報を含む位相角を持つ (表7.1)。</w:t>
       </w:r>
@@ -2178,7 +2713,7 @@
           <w:b w:val="0"/>
           <w:i w:val="0"/>
         </w:rPr>
-        <w:t>全 C(5,2)=10 変数ペアについてLiNGAM, SCD, Hodgeポテンシャルの因果方向を比較すると、一致と情報を含む不一致の両方が明らかになる。</w:t>
+        <w:t>全 C(5,2)=10 変数ペアについて3条件—DirectLiNGAM (A)、ドメイン知識付きスペクトル因果性 (B, α=0.6)、DPI単独スペクトル因果性 (C, α=0)—の因果方向を比較すると、一致と情報を含む不一致の両方が明らかになる。</w:t>
       </w:r>
     </w:p>
     <w:p>
@@ -2188,7 +2723,7 @@
           <w:b w:val="0"/>
           <w:i w:val="0"/>
         </w:rPr>
-        <w:t>手法間の不一致は情報的である: スペクトル因果性がLiNGAMと逆方向を示す場合、その変数ペアは「診断マーカー」関係を持つことが多い。これは「介入的因果性」(レベル2) と「情報的因果性」(レベル1.5) の区別を反映する。</w:t>
+        <w:t>手法間の不一致は情報的である: スペクトル因果性 (BまたはC) がDirectLiNGAM (A) と逆方向を示す場合、その変数ペアは「診断マーカー」関係を持つことが多い。これは「介入的因果性」(レベル2) と「情報的因果性」(レベル1.5) の区別を反映する。</w:t>
       </w:r>
     </w:p>
     <w:p>
@@ -2713,7 +3248,7 @@
           <w:b/>
           <w:i/>
         </w:rPr>
-        <w:t>注意 8.2 (部分的誤情報は無知より悪い)</w:t>
+        <w:t>注意 8.2 (生兵法は大怪我のもと)</w:t>
       </w:r>
     </w:p>
     <w:p>

</xml_diff>

<commit_message>
Expand Discussion section with 3 new subsections
- 11.2 Theoretical Implications: scale invariance practical consequence,
  U-curve risk formalization, phase-direction geometric perspective
- 11.3 Interpretation of Experimental Results: diagnostic marker reversals,
  feedback detection (73% curl on MaxHR-STDep), alpha-sweep complementarity
- 11.4 Examination of Assumptions: ANM scope/relaxability, tree DAG extension,
  q-selection, domain knowledge quality sensitivity

Discussion expanded from ~50 lines to ~150 lines. Total: 27 pages.
Docx (JA) regenerated with all 7 subsections (11.1-11.7).

Co-Authored-By: Tatsuki Onishi <bougtoir@gmail.com>
</commit_message>
<xml_diff>
--- a/spectral-causality-jmlr/spectral_causality_ja.docx
+++ b/spectral-causality-jmlr/spectral_causality_ja.docx
@@ -4622,7 +4622,141 @@
         <w:pStyle w:val="Heading2"/>
       </w:pPr>
       <w:r>
-        <w:t>11.2 計算量</w:t>
+        <w:t>11.2 理論的含意</w:t>
+      </w:r>
+    </w:p>
+    <w:p>
+      <w:pPr/>
+      <w:r>
+        <w:rPr>
+          <w:b w:val="0"/>
+          <w:i w:val="0"/>
+        </w:rPr>
+        <w:t>スケール不変性定理 (定理8.1) は実用的に重要な帰結を持つ: 非対称成分の符号構造が固定されれば、ドメイン知識行列 C_domain の正確な数値は r_gradient に無関係である。すなわち大まかな順序判断（「年齢は安静時血圧に先行する」）が正確な定量的推定と同等の構造情報を持つ。実務者にとって、方向が正しい限り粗い専門家知識でも有意味な因果構造回復が可能であることを意味する。</w:t>
+      </w:r>
+    </w:p>
+    <w:p>
+      <w:pPr/>
+      <w:r>
+        <w:rPr>
+          <w:b w:val="0"/>
+          <w:i w:val="0"/>
+        </w:rPr>
+        <w:t>U字型品質曲線 (定理8.2) は重要だが見落とされがちなリスクを定式化する: 部分的に誤ったドメイン知識の導入はドメイン知識を全く使わないよりも悪い結果をもたらしうる。臨界閾値 p*_flip ≈ 0.15 は、主張された辺方向の約15%超が誤りの場合、純粋にデータ駆動のベースライン (α=0) 以下に因果構造が劣化することを意味する。知識ベース因果発見パイプラインへの直接的含意: 専門家知識導入前に方向性主張の信頼性を推定し、信頼度が低い場合は α=0 (DPIのみ) の使用を検討すべきである。</w:t>
+      </w:r>
+    </w:p>
+    <w:p>
+      <w:pPr/>
+      <w:r>
+        <w:rPr>
+          <w:b w:val="0"/>
+          <w:i w:val="0"/>
+        </w:rPr>
+        <w:t>位相-方向対応 (定理3.1) はスペクトルグラフ理論と因果順序付けの深い接続を確立する: 磁気ラプラシアンの複素固有ベクトルが位相角を通じてトポロジカルソートを符号化する。この幾何学的視点はLiNGAMの代数的識別可能性結果を補完し、非ガウス性仮定の検証が困難な設定でスペクトル手法が代替的識別可能性条件を提供しうることを示唆する。</w:t>
+      </w:r>
+    </w:p>
+    <w:p>
+      <w:pPr>
+        <w:pStyle w:val="Heading2"/>
+      </w:pPr>
+      <w:r>
+        <w:t>11.3 実験結果の解釈</w:t>
+      </w:r>
+    </w:p>
+    <w:p>
+      <w:pPr/>
+      <w:r>
+        <w:rPr>
+          <w:b w:val="0"/>
+          <w:i w:val="0"/>
+        </w:rPr>
+        <w:t>DirectLiNGAMとスペクトル因果性の実験的比較は不一致に体系的パターンを明らかにする。10変数ペアのうち不一致は2カテゴリにクラスタする。</w:t>
+      </w:r>
+    </w:p>
+    <w:p>
+      <w:pPr/>
+      <w:r>
+        <w:rPr>
+          <w:b w:val="0"/>
+          <w:i w:val="0"/>
+        </w:rPr>
+        <w:t>診断マーカー逆転: (コレステロール, ST低下) や (安静時血圧, 最大心拍数) 等のペアでスペクトル因果性はLiNGAM方向を逆転させる。これらは下流変数（結果）が臨床で上流変数（原因）の診断指標として日常的に使用されるペアに正確に対応する。スペクトル枠組みの「情報的方向」は臨床推論の予測的構造を捕捉し、LiNGAMが回復する介入的構造と相補的（矛盾ではない）であることを示唆する。</w:t>
+      </w:r>
+    </w:p>
+    <w:p>
+      <w:pPr/>
+      <w:r>
+        <w:rPr>
+          <w:b w:val="0"/>
+          <w:i w:val="0"/>
+        </w:rPr>
+        <w:t>フィードバック検出: MaxHR↔STDep辺の73%カール成分は臨床的に有意である: 運動不耐性→虚血→心筋酸素需要増加→さらなる運動制限という病的フィードバックループを構成する。DAGベース手法は単方向辺 MaxHR→STDep を強制し、この双方向構造を失う。Hodge分解の辺ごとフィードバック比率定量化能力は、DAG仮定が妥当な辺 (&lt;10%カール) とフィードバックモデリングが不可欠な辺を判定する原理的基準を提供する。</w:t>
+      </w:r>
+    </w:p>
+    <w:p>
+      <w:pPr/>
+      <w:r>
+        <w:rPr>
+          <w:b w:val="0"/>
+          <w:i w:val="0"/>
+        </w:rPr>
+        <w:t>α掃引の滑らかな遷移 (r_gradient: α=0で0.581→α=1で0.859) は、ドメイン知識とデータ駆動推論が冗長ではなく相補的な情報を提供することを実証する。DPI単独 (α=0) で既にLiNGAMとの67%方向一致を達成する事実はDPIの有意性を検証し、ドメイン知識からの追加20+ポイントは信頼できる専門家入力の価値を強調する。</w:t>
+      </w:r>
+    </w:p>
+    <w:p>
+      <w:pPr>
+        <w:pStyle w:val="Heading2"/>
+      </w:pPr>
+      <w:r>
+        <w:t>11.4 仮定の検討</w:t>
+      </w:r>
+    </w:p>
+    <w:p>
+      <w:pPr/>
+      <w:r>
+        <w:rPr>
+          <w:b w:val="0"/>
+          <w:i w:val="0"/>
+        </w:rPr>
+        <w:t>加法ノイズモデル (ANM): 部分的識別可能性定理 (定理10.1) はANMデータ生成過程を仮定する。これはLiNGAMの線形性＋非ガウス性の同時要件より弱いが、乗法ノイズ、分散不均一モデル、事後非線形モデルを除外する。DPIのアンサンブル設計（3つの非対称成分の平均）はANM設定を超える経験的頑健性を提供するが、より広いモデルクラスへの形式的保証はオープン問題である。</w:t>
+      </w:r>
+    </w:p>
+    <w:p>
+      <w:pPr/>
+      <w:r>
+        <w:rPr>
+          <w:b w:val="0"/>
+          <w:i w:val="0"/>
+        </w:rPr>
+        <w:t>tree DAG構造: 位相-方向対応の証明 (付録A) は正の辺重みを持つtree DAGを仮定する。一般DAGへの拡張は複数の親を持つノードの処理を要し、固有ベクトル位相は単調関数でなく親位相の加重平均となる。予備的数値実験では有界入次数の疎DAGで近似的に成立するが、形式的証明は未達成。</w:t>
+      </w:r>
+    </w:p>
+    <w:p>
+      <w:pPr/>
+      <w:r>
+        <w:rPr>
+          <w:b w:val="0"/>
+          <w:i w:val="0"/>
+        </w:rPr>
+        <w:t>固定チャージパラメータ q: スペクトル解析はチャージパラメータ q に依存し、対称結合情報 (q=0) と方向位相情報 (q&gt;0) のトレードオフを制御する。原理的な q 選択手続き—カーネル法のバンド幅選択に類似—は枠組みの実用性を強化する。外部基準 (LiNGAM一致率やブートストラップ安定性) に対する交差検証が有望な方向である。</w:t>
+      </w:r>
+    </w:p>
+    <w:p>
+      <w:pPr/>
+      <w:r>
+        <w:rPr>
+          <w:b w:val="0"/>
+          <w:i w:val="0"/>
+        </w:rPr>
+        <w:t>ドメイン知識品質: 本枠組みは非負で因果影響強度に大まかに校正されたドメイン知識行列 C_domain へのアクセスを仮定する。定理8.1により符号構造のみがr_gradient に重要であるが、SCCとSCDの値は大きさに依存する。C_domain の摂動に対するスペクトル指標の感度分析は信頼区間を提供し、自然な拡張である。</w:t>
+      </w:r>
+    </w:p>
+    <w:p>
+      <w:pPr>
+        <w:pStyle w:val="Heading2"/>
+      </w:pPr>
+      <w:r>
+        <w:t>11.5 計算量</w:t>
       </w:r>
     </w:p>
     <w:p>
@@ -4640,7 +4774,7 @@
         <w:pStyle w:val="Heading2"/>
       </w:pPr>
       <w:r>
-        <w:t>11.3 限界</w:t>
+        <w:t>11.6 限界</w:t>
       </w:r>
     </w:p>
     <w:p>
@@ -4662,7 +4796,7 @@
         <w:pStyle w:val="Heading2"/>
       </w:pPr>
       <w:r>
-        <w:t>11.4 将来の方向性</w:t>
+        <w:t>11.7 将来の方向性</w:t>
       </w:r>
     </w:p>
     <w:p>

</xml_diff>